<commit_message>
docs(pgc): preenche par de revisãp
</commit_message>
<xml_diff>
--- a/docs/PGC-BGLP.docx
+++ b/docs/PGC-BGLP.docx
@@ -404,9 +404,8 @@
               <w:rPr>
                 <w:sz w:val="20"/>
                 <w:szCs w:val="20"/>
-                <w:highlight w:val="yellow"/>
-              </w:rPr>
-              <w:t xml:space="preserve">Nome do colega — @usuario-github</w:t>
+              </w:rPr>
+              <w:t xml:space="preserve">Kaian Dias (@KaianDias)</w:t>
             </w:r>
           </w:p>
         </w:tc>

</xml_diff>